<commit_message>
Fase 2: Modelo, Repositorio y Vista de Inventario funcionando
</commit_message>
<xml_diff>
--- a/ESPECIFICACIONES FUNCIONALES.docx
+++ b/ESPECIFICACIONES FUNCIONALES.docx
@@ -427,7 +427,25 @@
           <w:lang w:eastAsia="es-MX"/>
           <w14:ligatures w14:val="none"/>
         </w:rPr>
-        <w:t>Activar o desactivar productos del menú según disponibilidad.</w:t>
+        <w:t>Activar o desactivar productos del menú según disponibilidad</w:t>
+      </w:r>
+      <w:r>
+        <w:rPr>
+          <w:rFonts w:ascii="Times New Roman" w:eastAsia="Times New Roman" w:hAnsi="Times New Roman" w:cs="Times New Roman"/>
+          <w:kern w:val="0"/>
+          <w:lang w:eastAsia="es-MX"/>
+          <w14:ligatures w14:val="none"/>
+        </w:rPr>
+        <w:t xml:space="preserve"> de insumos</w:t>
+      </w:r>
+      <w:r>
+        <w:rPr>
+          <w:rFonts w:ascii="Times New Roman" w:eastAsia="Times New Roman" w:hAnsi="Times New Roman" w:cs="Times New Roman"/>
+          <w:kern w:val="0"/>
+          <w:lang w:eastAsia="es-MX"/>
+          <w14:ligatures w14:val="none"/>
+        </w:rPr>
+        <w:t>.</w:t>
       </w:r>
     </w:p>
     <w:p>
@@ -615,31 +633,16 @@
           <w:lang w:eastAsia="es-MX"/>
           <w14:ligatures w14:val="none"/>
         </w:rPr>
-        <w:t>Filtros por rangos de fecha (día, semana, mes).</w:t>
-      </w:r>
-    </w:p>
-    <w:p>
-      <w:pPr>
-        <w:numPr>
-          <w:ilvl w:val="0"/>
-          <w:numId w:val="4"/>
-        </w:numPr>
-        <w:spacing w:before="100" w:beforeAutospacing="1" w:after="100" w:afterAutospacing="1" w:line="240" w:lineRule="auto"/>
-        <w:rPr>
-          <w:rFonts w:ascii="Times New Roman" w:eastAsia="Times New Roman" w:hAnsi="Times New Roman" w:cs="Times New Roman"/>
-          <w:kern w:val="0"/>
-          <w:lang w:eastAsia="es-MX"/>
-          <w14:ligatures w14:val="none"/>
-        </w:rPr>
-      </w:pPr>
-      <w:r>
-        <w:rPr>
-          <w:rFonts w:ascii="Times New Roman" w:eastAsia="Times New Roman" w:hAnsi="Times New Roman" w:cs="Times New Roman"/>
-          <w:kern w:val="0"/>
-          <w:lang w:eastAsia="es-MX"/>
-          <w14:ligatures w14:val="none"/>
-        </w:rPr>
-        <w:t>Exportación de reportes a Excel (.xlsx) y PDF.</w:t>
+        <w:t>Filtros por rangos de fecha (día, semana, mes)</w:t>
+      </w:r>
+      <w:r>
+        <w:rPr>
+          <w:rFonts w:ascii="Times New Roman" w:eastAsia="Times New Roman" w:hAnsi="Times New Roman" w:cs="Times New Roman"/>
+          <w:kern w:val="0"/>
+          <w:lang w:eastAsia="es-MX"/>
+          <w14:ligatures w14:val="none"/>
+        </w:rPr>
+        <w:t>.</w:t>
       </w:r>
     </w:p>
     <w:p>

</xml_diff>